<commit_message>
feat(docs): update project reports and diagrams
Update project report, presentation script and diagrams
</commit_message>
<xml_diff>
--- a/Kich-ban-thuyet-trinh-LegacyVault.docx
+++ b/Kich-ban-thuyet-trinh-LegacyVault.docx
@@ -8507,7 +8507,21 @@
         <w:rPr>
           <w:rFonts w:ascii="Arial" w:cs="Arial" w:eastAsia="Arial" w:hAnsi="Arial"/>
         </w:rPr>
-        <w:t xml:space="preserve"> = aggregation; đường thẳng = association có bội số.</w:t>
+        <w:t xml:space="preserve"> = aggregation; đường thẳng = association có bội số; </w:t>
+      </w:r>
+      <w:r>
+        <w:rPr>
+          <w:rFonts w:ascii="Arial" w:cs="Arial" w:eastAsia="Arial" w:hAnsi="Arial"/>
+          <w:b/>
+          <w:bCs/>
+        </w:rPr>
+        <w:t xml:space="preserve">mũi tên tam giác rỗng</w:t>
+      </w:r>
+      <w:r>
+        <w:rPr>
+          <w:rFonts w:ascii="Arial" w:cs="Arial" w:eastAsia="Arial" w:hAnsi="Arial"/>
+        </w:rPr>
+        <w:t xml:space="preserve"> = generalization (kế thừa), mũi tên chỉ về lớp cha.</w:t>
       </w:r>
     </w:p>
     <w:p>
@@ -8523,7 +8537,7 @@
         <w:rPr>
           <w:rFonts w:ascii="Arial" w:cs="Arial" w:eastAsia="Arial" w:hAnsi="Arial"/>
         </w:rPr>
-        <w:t xml:space="preserve">Hàng trên cùng: User ở giữa, Notification và IntegrationConfig bên phải. Hàng thứ hai là năm lớp vai trò (VaultOwner, DigitalExecutor, Beneficiary, LegalVerifier, SystemAdministrator), mỗi lớp nối với User bằng association 1 – 0..1 và chứa các thao tác của vai trò đó.</w:t>
+        <w:t xml:space="preserve">Hàng trên cùng: User ở giữa, Notification và IntegrationConfig bên phải. Hàng thứ hai là năm lớp vai trò (VaultOwner, DigitalExecutor, Beneficiary, LegalVerifier, SystemAdministrator), mỗi lớp kế thừa từ User (generalization, mũi tên tam giác rỗng chỉ lên User) và bổ sung các thao tác của vai trò đó.</w:t>
       </w:r>
     </w:p>
     <w:p>
@@ -8590,7 +8604,7 @@
           <w:i/>
           <w:iCs/>
         </w:rPr>
-        <w:t xml:space="preserve">Class diagram có 24 lớp, đúng bằng 24 thực thể trong Conceptual, nên hai sơ đồ nhất quán với nhau. Nhóm dùng hình thoi đặc cho composition, hình thoi rỗng cho aggregation và đường thẳng cho association có bội số.</w:t>
+        <w:t xml:space="preserve">Class diagram có 24 lớp, đúng bằng 24 thực thể trong Conceptual, nên hai sơ đồ nhất quán với nhau. Nhóm dùng hình thoi đặc cho composition, hình thoi rỗng cho aggregation, đường thẳng cho association có bội số và mũi tên tam giác rỗng cho kế thừa.</w:t>
       </w:r>
     </w:p>
     <w:p>
@@ -8608,7 +8622,7 @@
           <w:i/>
           <w:iCs/>
         </w:rPr>
-        <w:t xml:space="preserve">User giữ dữ liệu tài khoản chung và các thao tác đăng nhập, đăng xuất, xác thực OTP. Mỗi vai trò là một lớp riêng nối với User bằng association một – không hoặc một: VaultOwner có các thao tác tạo vault, tạo tài sản, gán người nhận, cấu hình Dead Man's Switch; DigitalExecutor gửi yêu cầu xác minh và theo dõi bàn giao; Beneficiary xác thực danh tính, tải và xác nhận tài sản; LegalVerifier xem xét, kiểm tra chữ ký và ký duyệt; SystemAdministrator quản lý người dùng, quyền, chính sách và tích hợp.</w:t>
+        <w:t xml:space="preserve">User giữ dữ liệu tài khoản chung và các thao tác đăng nhập, đăng xuất, xác thực OTP. Năm vai trò đều là lớp con kế thừa từ User, nên có sẵn các thao tác chung và thêm phần riêng: VaultOwner có các thao tác tạo vault, tạo tài sản, gán người nhận, cấu hình Dead Man's Switch; DigitalExecutor gửi yêu cầu xác minh và theo dõi bàn giao; Beneficiary xác thực danh tính, tải và xác nhận tài sản; LegalVerifier xem xét, kiểm tra chữ ký và ký duyệt; SystemAdministrator quản lý người dùng, quyền, chính sách và tích hợp.</w:t>
       </w:r>
     </w:p>
     <w:p>
@@ -8715,7 +8729,7 @@
           <w:b/>
           <w:bCs/>
         </w:rPr>
-        <w:t xml:space="preserve">Tại sao các vai trò là lớp riêng nối với User bằng association mà không dùng kế thừa?</w:t>
+        <w:t xml:space="preserve">Tại sao các vai trò kế thừa từ User thay vì là một thuộc tính role?</w:t>
       </w:r>
     </w:p>
     <w:p>
@@ -8736,7 +8750,7 @@
         <w:rPr>
           <w:rFonts w:ascii="Arial" w:cs="Arial" w:eastAsia="Arial" w:hAnsi="Arial"/>
         </w:rPr>
-        <w:t xml:space="preserve">Vì Conceptual mô hình hóa mỗi vai trò là một hồ sơ gắn với User (1 – 0..1), và Class diagram bám theo. Cách này cho phép một người có nhiều vai trò cùng lúc, ví dụ chủ kho của vault A và người thụ hưởng ở vault B, điều mà kế thừa đơn không làm được.</w:t>
+        <w:t xml:space="preserve">Mỗi vai trò có thao tác và dữ liệu riêng (ví dụ LegalVerifier có licenseNo, Beneficiary có kycStatus), còn đăng nhập, đăng xuất, OTP và thông tin tài khoản dùng chung nằm ở User. Kế thừa cho phép dùng lại phần chung và vẫn tách phần riêng. Conceptual thể hiện vai trò là hồ sơ gắn với User, còn Class diagram thể hiện cùng 24 lớp đó bằng quan hệ kế thừa.</w:t>
       </w:r>
     </w:p>
     <w:p>
@@ -8824,7 +8838,7 @@
         <w:rPr>
           <w:rFonts w:ascii="Arial" w:cs="Arial" w:eastAsia="Arial" w:hAnsi="Arial"/>
         </w:rPr>
-        <w:t xml:space="preserve">Theo Conceptual mới, vai trò là các lớp hồ sơ nối với User, còn SystemAdministrator quản lý Permission. Không còn lớp Role riêng.</w:t>
+        <w:t xml:space="preserve">Theo Conceptual mới, vai trò là các lớp hồ sơ gắn với User (trong Class diagram là lớp con của User), còn SystemAdministrator quản lý Permission. Không còn lớp Role riêng.</w:t>
       </w:r>
     </w:p>
     <w:p>

</xml_diff>

<commit_message>
chore(docs): update project files
Update project documentation and diagrams
</commit_message>
<xml_diff>
--- a/Kich-ban-thuyet-trinh-LegacyVault.docx
+++ b/Kich-ban-thuyet-trinh-LegacyVault.docx
@@ -6865,7 +6865,23 @@
         <w:rPr>
           <w:rFonts w:ascii="Arial" w:cs="Arial" w:eastAsia="Arial" w:hAnsi="Arial"/>
         </w:rPr>
-        <w:t xml:space="preserve">Đi theo số thứ tự 1 đến 9, nói ngắn mỗi bước.</w:t>
+        <w:t xml:space="preserve">Giải thích ký hiệu: hình chữ nhật có tên gạch chân là đối tượng, hộp «actor» là người dùng; đường thẳng là liên kết; mũi tên kèm số là thông điệp đi từ bên gửi sang bên nhận.</w:t>
+      </w:r>
+    </w:p>
+    <w:p>
+      <w:pPr>
+        <w:pStyle w:val="ListParagraph"/>
+        <w:numPr>
+          <w:ilvl w:val="0"/>
+          <w:numId w:val="9"/>
+        </w:numPr>
+        <w:spacing w:after="60" w:line="276"/>
+      </w:pPr>
+      <w:r>
+        <w:rPr>
+          <w:rFonts w:ascii="Arial" w:cs="Arial" w:eastAsia="Arial" w:hAnsi="Arial"/>
+        </w:rPr>
+        <w:t xml:space="preserve">Đi theo số thứ tự 1 đến 9, nói ngắn mỗi bước. Số có phần thập phân (2.1, 3.1, 5.1) là thông điệp lồng bên trong thông điệp cha, vẽ thành vòng lặp quay về chính đối tượng.</w:t>
       </w:r>
     </w:p>
     <w:p>
@@ -6900,7 +6916,7 @@
           <w:i/>
           <w:iCs/>
         </w:rPr>
-        <w:t xml:space="preserve">Sơ đồ giao tiếp cho thấy các đối tượng tham gia và liên kết giữa chúng, thứ tự thông điệp được đánh số. Một, DMS báo cho executor là bàn giao đã được kích hoạt. Hai, executor nộp giấy chứng tử cho Legal Verification Request. Ba, yêu cầu được chuyển cho Legal Verifier. Bốn, verifier duyệt và ký điện tử. Năm, vault được mở khóa. Sáu, hệ thống tạo assignment cho từng tài sản. Bảy, beneficiary được báo có tài sản. Tám, beneficiary xác nhận đã nhận. Chín, tiến độ được gửi ngược về executor.</w:t>
+        <w:t xml:space="preserve">Sơ đồ giao tiếp cho thấy các đối tượng tham gia và liên kết giữa chúng, thứ tự thông điệp được đánh số. Một, DMS báo cho executor là bàn giao đã được kích hoạt. Hai, executor nộp giấy chứng tử cho Legal Verification Request; trong bước này yêu cầu tự lưu với trạng thái PENDING, đó là thông điệp 2.1. Ba, yêu cầu được chuyển cho Legal Verifier, và verifier kiểm tra chữ ký số, thông điệp 3.1. Bốn, verifier duyệt và ký điện tử. Năm, vault được mở khóa và tự đặt trạng thái UNLOCKED, thông điệp 5.1. Sáu, hệ thống tạo assignment cho từng tài sản. Bảy, beneficiary được báo có tài sản. Tám, beneficiary xác nhận đã nhận. Chín, tiến độ được gửi ngược về executor.</w:t>
       </w:r>
     </w:p>
     <w:p>

</xml_diff>

<commit_message>
fix(communication): fix communication diagram
</commit_message>
<xml_diff>
--- a/Kich-ban-thuyet-trinh-LegacyVault.docx
+++ b/Kich-ban-thuyet-trinh-LegacyVault.docx
@@ -8182,7 +8182,7 @@
         <w:rPr>
           <w:rFonts w:ascii="Arial" w:cs="Arial" w:eastAsia="Arial" w:hAnsi="Arial"/>
         </w:rPr>
-        <w:t xml:space="preserve">Cho thầy thấy tổ chức theo gói và hướng phụ thuộc giữa các gói (mũi tên nét đứt: gói này dùng gói kia).</w:t>
+        <w:t xml:space="preserve">Cho thầy thấy hệ thống được tổ chức thành các tầng gói và gói nào phụ thuộc gói nào.</w:t>
       </w:r>
     </w:p>
     <w:p>
@@ -8215,7 +8215,7 @@
         <w:rPr>
           <w:rFonts w:ascii="Arial" w:cs="Arial" w:eastAsia="Arial" w:hAnsi="Arial"/>
         </w:rPr>
-        <w:t xml:space="preserve">Chỉ hai gói ở trên cùng: Dead Man's Switch và Digital Asset Handover, là các gói điều phối luồng.</w:t>
+        <w:t xml:space="preserve">Giải thích ký hiệu: gói vẽ như thư mục (hình chữ nhật có tab nhỏ), gói có thể chứa gói con; mũi tên nét đứt là phụ thuộc, gói ở đuôi mũi tên dùng gói ở đầu mũi tên.</w:t>
       </w:r>
     </w:p>
     <w:p>
@@ -8231,7 +8231,7 @@
         <w:rPr>
           <w:rFonts w:ascii="Arial" w:cs="Arial" w:eastAsia="Arial" w:hAnsi="Arial"/>
         </w:rPr>
-        <w:t xml:space="preserve">Tầng giữa: Legal Verification, Beneficiary &amp; Executor Management, Digital Vault Management.</w:t>
+        <w:t xml:space="preserve">Khung ngoài cùng là LegacyVault System, bên trong có bốn nhóm: Presentation Layer, Business Layer, Cross Cutting và Data Layer. Ngoài khung là Users (bên trái) và External Systems (bên phải).</w:t>
       </w:r>
     </w:p>
     <w:p>
@@ -8247,7 +8247,23 @@
         <w:rPr>
           <w:rFonts w:ascii="Arial" w:cs="Arial" w:eastAsia="Arial" w:hAnsi="Arial"/>
         </w:rPr>
-        <w:t xml:space="preserve">Tầng dưới là gói nền tảng dùng chung: Encryption &amp; Security, Identity &amp; Access Management, System Configuration, Audit &amp; Monitoring, Notification Management, External Integrations.</w:t>
+        <w:t xml:space="preserve">Đi theo chiều mũi tên: Users → Presentation → Business → Data. Hai nhóm phía trên (Presentation, Business) cùng dùng Cross Cutting. Data Layer dùng các kho dữ liệu bên dưới và dùng External Systems qua External Service Adapters.</w:t>
+      </w:r>
+    </w:p>
+    <w:p>
+      <w:pPr>
+        <w:pStyle w:val="ListParagraph"/>
+        <w:numPr>
+          <w:ilvl w:val="0"/>
+          <w:numId w:val="13"/>
+        </w:numPr>
+        <w:spacing w:after="60" w:line="276"/>
+      </w:pPr>
+      <w:r>
+        <w:rPr>
+          <w:rFonts w:ascii="Arial" w:cs="Arial" w:eastAsia="Arial" w:hAnsi="Arial"/>
+        </w:rPr>
+        <w:t xml:space="preserve">Trong Business Layer: DMS &amp; Handover → Legal Verification và Executor &amp; Beneficiary; Legal Verification → Executor &amp; Beneficiary và Identity &amp; Access; Executor &amp; Beneficiary → Vault &amp; Asset; Vault &amp; Asset → Identity &amp; Access.</w:t>
       </w:r>
     </w:p>
     <w:p>
@@ -8282,7 +8298,43 @@
           <w:i/>
           <w:iCs/>
         </w:rPr>
-        <w:t xml:space="preserve">Hệ thống chia thành 11 gói. Dead Man's Switch và Digital Asset Handover ở trên cùng. Dead Man's Switch dùng Digital Vault Management, Notification, System Configuration và Digital Asset Handover. Digital Asset Handover dùng Legal Verification, Beneficiary &amp; Executor Management, Encryption &amp; Security, Identity &amp; Access, Notification và Audit &amp; Monitoring. Legal Verification và Identity &amp; Access dùng gói External Integrations. Các gói nền tảng ở dưới như mã hóa, nhật ký, thông báo được dùng chung nên không phụ thuộc ngược lên gói nghiệp vụ.</w:t>
+        <w:t xml:space="preserve">Sơ đồ gói được vẽ theo kiểu phân tầng. Mỗi gói là một thư mục, mũi tên nét đứt cho biết gói nào dùng gói nào. Bên trong gói LegacyVault System có bốn nhóm. Presentation Layer gồm Web Portal và API Gateway. Business Layer gồm năm gói: Identity &amp; Access, Vault &amp; Asset, DMS &amp; Handover, Legal Verification và Executor &amp; Beneficiary, chứa 20 trong 24 lớp của Class diagram. Cross Cutting gồm Notification, Audit &amp; Monitoring và System Configuration, chứa bốn lớp còn lại. Data Layer gồm Repositories và External Service Adapters.</w:t>
+      </w:r>
+    </w:p>
+    <w:p>
+      <w:pPr>
+        <w:pBdr>
+          <w:left w:val="single" w:color="9DB7DD" w:sz="18" w:space="10"/>
+        </w:pBdr>
+        <w:shd w:fill="F3F7FC" w:val="clear"/>
+        <w:spacing w:after="80" w:line="288"/>
+        <w:ind w:left="240"/>
+      </w:pPr>
+      <w:r>
+        <w:rPr>
+          <w:rFonts w:ascii="Arial" w:cs="Arial" w:eastAsia="Arial" w:hAnsi="Arial"/>
+          <w:i/>
+          <w:iCs/>
+        </w:rPr>
+        <w:t xml:space="preserve">Người dùng đi vào qua Presentation Layer, xuống Business Layer rồi xuống Data Layer. Presentation và Business cùng dùng nhóm Cross Cutting. Repositories đọc ghi cơ sở dữ liệu, kho đối tượng mã hóa và kho nhật ký; External Service Adapters gọi các nhà cung cấp bên ngoài như eKYC, gửi thông báo và chữ ký số.</w:t>
+      </w:r>
+    </w:p>
+    <w:p>
+      <w:pPr>
+        <w:pBdr>
+          <w:left w:val="single" w:color="9DB7DD" w:sz="18" w:space="10"/>
+        </w:pBdr>
+        <w:shd w:fill="F3F7FC" w:val="clear"/>
+        <w:spacing w:after="80" w:line="288"/>
+        <w:ind w:left="240"/>
+      </w:pPr>
+      <w:r>
+        <w:rPr>
+          <w:rFonts w:ascii="Arial" w:cs="Arial" w:eastAsia="Arial" w:hAnsi="Arial"/>
+          <w:i/>
+          <w:iCs/>
+        </w:rPr>
+        <w:t xml:space="preserve">Trong Business Layer, DMS &amp; Handover dùng Legal Verification và Executor &amp; Beneficiary; Legal Verification dùng Executor &amp; Beneficiary và Identity &amp; Access; Executor &amp; Beneficiary dùng Vault &amp; Asset, và Vault &amp; Asset dùng Identity &amp; Access. Phụ thuộc chỉ đi xuống nên Business Layer không phụ thuộc ngược lên giao diện.</w:t>
       </w:r>
     </w:p>
     <w:p>
@@ -8315,7 +8367,23 @@
         <w:rPr>
           <w:rFonts w:ascii="Arial" w:cs="Arial" w:eastAsia="Arial" w:hAnsi="Arial"/>
         </w:rPr>
-        <w:t xml:space="preserve">Hướng phụ thuộc đi từ gói nghiệp vụ xuống gói nền tảng. Nhờ vậy thay thế nhà cung cấp tích hợp hay đổi cách mã hóa không kéo theo sửa nghiệp vụ.</w:t>
+        <w:t xml:space="preserve">Hướng phụ thuộc đi từ trên xuống. Nhờ vậy đổi giao diện, đổi nhà cung cấp tích hợp hay đổi cơ sở dữ liệu không kéo theo sửa nghiệp vụ.</w:t>
+      </w:r>
+    </w:p>
+    <w:p>
+      <w:pPr>
+        <w:pStyle w:val="ListParagraph"/>
+        <w:numPr>
+          <w:ilvl w:val="0"/>
+          <w:numId w:val="2"/>
+        </w:numPr>
+        <w:spacing w:after="60" w:line="276"/>
+      </w:pPr>
+      <w:r>
+        <w:rPr>
+          <w:rFonts w:ascii="Arial" w:cs="Arial" w:eastAsia="Arial" w:hAnsi="Arial"/>
+        </w:rPr>
+        <w:t xml:space="preserve">Mỗi lớp của Class diagram nằm trong đúng một gói; cộng lại được 24 lớp (Business 8 + 4 + 4 + 2 + 2, Cross Cutting 1 + 1 + 2). Bảng ngay dưới hình liệt kê lớp của từng gói.</w:t>
       </w:r>
     </w:p>
     <w:p>
@@ -8355,7 +8423,7 @@
           <w:b/>
           <w:bCs/>
         </w:rPr>
-        <w:t xml:space="preserve">Tại sao Audit &amp; Monitoring và Notification ở dưới cùng?</w:t>
+        <w:t xml:space="preserve">Tại sao Notification và Audit &amp; Monitoring nằm ở Cross Cutting?</w:t>
       </w:r>
     </w:p>
     <w:p>
@@ -8376,7 +8444,95 @@
         <w:rPr>
           <w:rFonts w:ascii="Arial" w:cs="Arial" w:eastAsia="Arial" w:hAnsi="Arial"/>
         </w:rPr>
-        <w:t xml:space="preserve">Vì nhiều gói khác cùng gọi tới chúng (mọi thay đổi trạng thái cần log, nhiều sự kiện cần thông báo); đặt ở nền để dùng chung.</w:t>
+        <w:t xml:space="preserve">Vì nhiều gói nghiệp vụ cùng gọi tới chúng (mọi thay đổi trạng thái cần ghi log, nhiều sự kiện cần thông báo) nhưng bản thân chúng không cần biết nghiệp vụ, chỉ cần mã user hoặc vault.</w:t>
+      </w:r>
+    </w:p>
+    <w:p>
+      <w:pPr>
+        <w:keepNext/>
+        <w:spacing w:after="20" w:before="80" w:line="276"/>
+      </w:pPr>
+      <w:r>
+        <w:rPr>
+          <w:rFonts w:ascii="Arial" w:cs="Arial" w:eastAsia="Arial" w:hAnsi="Arial"/>
+          <w:b/>
+          <w:bCs/>
+          <w:color w:val="B03A2E"/>
+        </w:rPr>
+        <w:t xml:space="preserve">Hỏi: </w:t>
+      </w:r>
+      <w:r>
+        <w:rPr>
+          <w:rFonts w:ascii="Arial" w:cs="Arial" w:eastAsia="Arial" w:hAnsi="Arial"/>
+          <w:b/>
+          <w:bCs/>
+        </w:rPr>
+        <w:t xml:space="preserve">Tại sao External Systems nằm ngoài khung hệ thống?</w:t>
+      </w:r>
+    </w:p>
+    <w:p>
+      <w:pPr>
+        <w:spacing w:after="80" w:line="276"/>
+        <w:ind w:left="360"/>
+      </w:pPr>
+      <w:r>
+        <w:rPr>
+          <w:rFonts w:ascii="Arial" w:cs="Arial" w:eastAsia="Arial" w:hAnsi="Arial"/>
+          <w:b/>
+          <w:bCs/>
+          <w:color w:val="1E7B3A"/>
+        </w:rPr>
+        <w:t xml:space="preserve">Đáp: </w:t>
+      </w:r>
+      <w:r>
+        <w:rPr>
+          <w:rFonts w:ascii="Arial" w:cs="Arial" w:eastAsia="Arial" w:hAnsi="Arial"/>
+        </w:rPr>
+        <w:t xml:space="preserve">Vì đó là dịch vụ của bên thứ ba. Hệ thống chỉ gọi qua External Service Adapters (các interface IIdentityVerification, INotification, IDigitalSignature ở Component diagram) nên thay nhà cung cấp không phải sửa nghiệp vụ.</w:t>
+      </w:r>
+    </w:p>
+    <w:p>
+      <w:pPr>
+        <w:keepNext/>
+        <w:spacing w:after="20" w:before="80" w:line="276"/>
+      </w:pPr>
+      <w:r>
+        <w:rPr>
+          <w:rFonts w:ascii="Arial" w:cs="Arial" w:eastAsia="Arial" w:hAnsi="Arial"/>
+          <w:b/>
+          <w:bCs/>
+          <w:color w:val="B03A2E"/>
+        </w:rPr>
+        <w:t xml:space="preserve">Hỏi: </w:t>
+      </w:r>
+      <w:r>
+        <w:rPr>
+          <w:rFonts w:ascii="Arial" w:cs="Arial" w:eastAsia="Arial" w:hAnsi="Arial"/>
+          <w:b/>
+          <w:bCs/>
+        </w:rPr>
+        <w:t xml:space="preserve">Package diagram khác Component diagram chỗ nào?</w:t>
+      </w:r>
+    </w:p>
+    <w:p>
+      <w:pPr>
+        <w:spacing w:after="80" w:line="276"/>
+        <w:ind w:left="360"/>
+      </w:pPr>
+      <w:r>
+        <w:rPr>
+          <w:rFonts w:ascii="Arial" w:cs="Arial" w:eastAsia="Arial" w:hAnsi="Arial"/>
+          <w:b/>
+          <w:bCs/>
+          <w:color w:val="1E7B3A"/>
+        </w:rPr>
+        <w:t xml:space="preserve">Đáp: </w:t>
+      </w:r>
+      <w:r>
+        <w:rPr>
+          <w:rFonts w:ascii="Arial" w:cs="Arial" w:eastAsia="Arial" w:hAnsi="Arial"/>
+        </w:rPr>
+        <w:t xml:space="preserve">Package diagram nhóm các phần tử mô hình (ở đây là lớp) và cho thấy phụ thuộc giữa các nhóm; Component diagram cho thấy các thành phần chạy được và giao diện giữa chúng.</w:t>
       </w:r>
     </w:p>
     <w:p>
@@ -9654,7 +9810,7 @@
         <w:rPr>
           <w:rFonts w:ascii="Arial" w:cs="Arial" w:eastAsia="Arial" w:hAnsi="Arial"/>
         </w:rPr>
-        <w:t xml:space="preserve">Mô hình có tham chiếu khóa mã hóa trên Vault (encryptionKeyRef) và dữ liệu mã hóa E2E khi lưu, giải mã khi mở khóa. Chi tiết quản lý khóa thuộc phần triển khai, nằm trong gói Encryption &amp; Security.</w:t>
+        <w:t xml:space="preserve">Mô hình có tham chiếu khóa mã hóa trên Vault (encryptionKeyRef) và dữ liệu mã hóa E2E khi lưu, giải mã khi mở khóa. Chi tiết quản lý khóa thuộc phần triển khai; về mặt gói, các thao tác encrypt/decrypt nằm trong lớp DigitalAsset của gói Vault &amp; Asset.</w:t>
       </w:r>
     </w:p>
     <w:p>

</xml_diff>